<commit_message>
fix: align final foreground-sufficiency terminology
</commit_message>
<xml_diff>
--- a/paper/CXT-Fish_IMTS_Submission_Ready_v4.docx
+++ b/paper/CXT-Fish_IMTS_Submission_Ready_v4.docx
@@ -2358,22 +2358,8 @@
             </w:tcMar>
           </w:tcPr>
           <w:p>
-            <w:pPr>
-              <w:spacing w:after="0" w:before="0"/>
-            </w:pPr>
-            <w:r>
-              <w:rPr>
-                <w:rFonts w:ascii="Times New Roman" w:hAnsi="Times New Roman" w:eastAsia="Times New Roman"/>
-                <w:sz w:val="17"/>
-              </w:rPr>
-            </w:r>
-            <w:r>
-              <w:rPr>
-                <w:rFonts w:ascii="Times New Roman" w:hAnsi="Times New Roman" w:eastAsia="Times New Roman"/>
-                <w:b w:val="0"/>
-                <w:sz w:val="17"/>
-              </w:rPr>
-              <w:t>Can subject evidence independently support the label?</w:t>
+            <w:r>
+              <w:t>Does label predictiveness persist after fine-context suppression?</w:t>
             </w:r>
           </w:p>
         </w:tc>
@@ -2764,7 +2750,7 @@
         <w:widowControl w:val="1"/>
       </w:pPr>
       <w:r>
-        <w:t>Foreground sufficiency does not require original and foreground representations to coincide. Instead, it means that the context-suppressed view remains independently label-predictive under the auxiliary cross-entropy term. The term therefore describes the training intervention and its operational evaluation, not a formal subject-only identifiability claim.</w:t>
+        <w:t>Foreground sufficiency does not require original and foreground representations to coincide. Instead, it means that the context-suppressed view remains separately label-predictive under the auxiliary cross-entropy term. The term therefore describes the training intervention and its operational evaluation, not a formal subject-only identifiability claim.</w:t>
       </w:r>
     </w:p>
     <w:p>

</xml_diff>